<commit_message>
Entregable Maker Lab listo: BiblioTech como demo, 5 bibliotecas piloto y bitácora real de la sesión
Co-Authored-By: Claude Opus 5.5 <noreply@anthropic.com>
Claude-Session: https://claude.ai/code/session_011usEwMPrKxbEBJCtKfXjqw
</commit_message>
<xml_diff>
--- a/Entregable_Maker_Lab_IA_DEXA_Desafio_Naranja_2026.docx
+++ b/Entregable_Maker_Lab_IA_DEXA_Desafio_Naranja_2026.docx
@@ -1393,7 +1393,25 @@
                 <w:sz w:val="20"/>
                 <w:szCs w:val="20"/>
               </w:rPr>
-              <w:t xml:space="preserve"> BiblioTech (gestión de bibliotecas, demo funcional), DEXA Vet (gestión veterinaria, planes de RD$900 a RD$1,200 al mes), After (hábitos y finanzas con IA, lanzada) y proyectos entregados (psicologo.do, LIDERA ERP).</w:t>
+              <w:t xml:space="preserve"> BiblioTech (gestión de bibliotecas con catálogo, préstamos, portal del lector y reportes; demo funcional; </w:t>
+            </w:r>
+            <w:r>
+              <w:rPr>
+                <w:b w:val="1"/>
+                <w:bCs w:val="1"/>
+                <w:color w:val="3454D1"/>
+                <w:sz w:val="20"/>
+                <w:szCs w:val="20"/>
+              </w:rPr>
+              <w:t xml:space="preserve">producto de la demo en vivo</w:t>
+            </w:r>
+            <w:r>
+              <w:rPr>
+                <w:color w:val="14161C"/>
+                <w:sz w:val="20"/>
+                <w:szCs w:val="20"/>
+              </w:rPr>
+              <w:t xml:space="preserve">), sistema de facturación electrónica e-CF, DEXA Vet (en desarrollo), After (hábitos y finanzas con IA, lanzada) y proyectos entregados (psicologo.do, LIDERA ERP).</w:t>
             </w:r>
           </w:p>
           <w:p>
@@ -1416,7 +1434,7 @@
                 <w:sz w:val="20"/>
                 <w:szCs w:val="20"/>
               </w:rPr>
-              <w:t xml:space="preserve"> una PYME que aún trabaja con cuadernos, Excel o WhatsApp. </w:t>
+              <w:t xml:space="preserve"> organizaciones y PYMES que aún trabajan con cuadernos, Excel o WhatsApp. </w:t>
             </w:r>
             <w:r>
               <w:rPr>
@@ -1691,7 +1709,7 @@
                 <w:sz w:val="17"/>
                 <w:szCs w:val="17"/>
               </w:rPr>
-              <w:t xml:space="preserve">&lt;rol&gt; Eres estratega de producto y storytelling para startups de software latinoamericanas y has sido jurado de concursos de economía naranja. Lees cada frase como lo haría el dueño de una PYME dominicana sin formación técnica: si algo suena a jerga, lo descartas. &lt;/rol&gt; &lt;contexto&gt; DEXA Technologies es una empresa de software fundada en Constanza, República Dominicana, por un estudiante de Ingeniería de Software. Crea software especializado por sector, con IA integrada, soporte local en español y precios en pesos. Portafolio: BiblioTech (gestión de bibliotecas, demo funcional), DEXA Vet (gestión veterinaria, planes de RD$900 a RD$1,200 al mes), After (hábitos y finanzas con IA, lanzada) y proyectos entregados a clientes (psicologo.do, LIDERA ERP). Cliente objetivo: PYME que aún opera con cuadernos, Excel o WhatsApp. Competencia: desarrolladoras locales sin producto propio y plataformas extranjeras cobradas en dólares y sin soporte local. Mascota: HALO, un robot con cabeza de monitor retro y hoodie blanco. Lema: «Diseñando tecnología para un mundo más inteligente». &lt;/contexto&gt; &lt;tarea&gt; 1) Construye la ficha del cliente ideal (perfil, dolores, beneficios esperados y objeciones). 2) Redacta 3 variantes de Propuesta Única de Valor (máximo 30 palabras cada una), elige la más fuerte y justifica la elección. 3) Diseña el arco de un pitch de 3 minutos para el Desafío Naranja 2026 guiado por HALO. 4) Evalúa tu propio resultado como jurado y corrige lo débil antes de entregar. &lt;/tarea&gt; &lt;formato&gt; Ficha en viñetas; PUV en un cuadro delimitado; pitch en una tabla de 5 escenas (tiempo · qué dice HALO · qué se ve en pantalla); al final, una rúbrica del 1 al 5 con la versión corregida de todo lo que obtenga menos de 4. &lt;/formato&gt; &lt;restricciones&gt; Usa español claro y un tono profesional y cercano. No uses «innovador», «escalable», «SaaS» ni «transformación digital». No inventes cifras, clientes ni estadísticas; si falta un dato, escribe [POR CONFIRMAR]. Si falta algo crítico, hazme como máximo 3 preguntas antes de empezar; si no falta nada, procede. &lt;/restricciones&gt;</w:t>
+              <w:t xml:space="preserve">&lt;rol&gt; Eres estratega de producto y storytelling para startups de software latinoamericanas y has sido jurado de concursos de economía naranja. Lees cada frase como lo haría el dueño de una PYME dominicana sin formación técnica: si algo suena a jerga, lo descartas. &lt;/rol&gt; &lt;contexto&gt; DEXA Technologies es una empresa de software fundada en Constanza, República Dominicana, por un estudiante de Ingeniería de Software. Crea software especializado por sector, con IA integrada, soporte local en español y precios en pesos. Portafolio: BiblioTech (gestión de bibliotecas con catálogo, préstamos, portal del lector y reportes; demo funcional; es el producto de la demo en vivo), sistema de facturación electrónica e-CF, DEXA Vet (gestión veterinaria, en desarrollo), After (hábitos y finanzas con IA, lanzada) y proyectos entregados a clientes (psicologo.do, LIDERA ERP). Cliente objetivo: organizaciones y PYMES que aún operan con cuadernos, Excel o WhatsApp. Competencia: desarrolladoras locales sin producto propio y plataformas extranjeras cobradas en dólares y sin soporte local. Mascota: HALO, un robot con cabeza de monitor retro y hoodie blanco. Lema: «Diseñando tecnología para un mundo más inteligente». &lt;/contexto&gt; &lt;tarea&gt; 1) Construye la ficha del cliente ideal (perfil, dolores, beneficios esperados y objeciones). 2) Redacta 3 variantes de Propuesta Única de Valor (máximo 30 palabras cada una), elige la más fuerte y justifica la elección. 3) Diseña el arco de un pitch de 3 minutos para el Desafío Naranja 2026 guiado por HALO. 4) Evalúa tu propio resultado como jurado y corrige lo débil antes de entregar. &lt;/tarea&gt; &lt;formato&gt; Ficha en viñetas; PUV en un cuadro delimitado; pitch en una tabla de 5 escenas (tiempo · qué dice HALO · qué se ve en pantalla); al final, una rúbrica del 1 al 5 con la versión corregida de todo lo que obtenga menos de 4. &lt;/formato&gt; &lt;restricciones&gt; Usa español claro y un tono profesional y cercano. No uses «innovador», «escalable», «SaaS» ni «transformación digital». No inventes cifras, clientes ni estadísticas; si falta un dato, escribe [POR CONFIRMAR]. Si falta algo crítico, hazme como máximo 3 preguntas antes de empezar; si no falta nada, procede. &lt;/restricciones&gt;</w:t>
             </w:r>
           </w:p>
         </w:tc>
@@ -1847,7 +1865,7 @@
                 <w:sz w:val="20"/>
                 <w:szCs w:val="20"/>
               </w:rPr>
-              <w:t xml:space="preserve"> pequeñas y medianas empresas de Latinoamérica que buscan transformación digital…</w:t>
+              <w:t xml:space="preserve"> dueño o administrador de una PYME u organización dominicana de 2 a 20 personas (bibliotecas, clínicas, comercios y oficinas) que factura formalmente…</w:t>
             </w:r>
           </w:p>
           <w:p>
@@ -1874,12 +1892,12 @@
                 <w:sz w:val="20"/>
                 <w:szCs w:val="20"/>
               </w:rPr>
-              <w:t xml:space="preserve"> DEXA Technologies ofrece soluciones de software innovadoras, escalables e impulsadas por IA que transforman digitalmente a las PYMES de la región.</w:t>
-            </w:r>
-          </w:p>
-          <w:p>
-            <w:pPr>
-              <w:spacing w:before="0" w:after="80" w:line="264" w:lineRule="auto"/>
+              <w:t xml:space="preserve"> Software hecho para tu tipo de negocio, en español, en pesos y con gente de aquí que te responde.</w:t>
+            </w:r>
+          </w:p>
+          <w:p>
+            <w:pPr>
+              <w:spacing w:before="0" w:after="40" w:line="264" w:lineRule="auto"/>
             </w:pPr>
             <w:r>
               <w:rPr>
@@ -1891,7 +1909,7 @@
                 <w:sz w:val="20"/>
                 <w:szCs w:val="20"/>
               </w:rPr>
-              <w:t xml:space="preserve">Rúbrica:</w:t>
+              <w:t xml:space="preserve">Pitch, escena 4:</w:t>
             </w:r>
             <w:r>
               <w:rPr>
@@ -1901,7 +1919,56 @@
                 <w:sz w:val="20"/>
                 <w:szCs w:val="20"/>
               </w:rPr>
-              <w:t xml:space="preserve"> claridad 5 · diferenciación 5 · emoción 5 · credibilidad 5 · llamado a la acción 5.»</w:t>
+              <w:t xml:space="preserve"> «Y no solo bibliotecas: también tenemos facturación electrónica, DEXA Vet y After». </w:t>
+            </w:r>
+            <w:r>
+              <w:rPr>
+                <w:b w:val="1"/>
+                <w:bCs w:val="1"/>
+                <w:i w:val="1"/>
+                <w:iCs w:val="1"/>
+                <w:color w:val="3454D1"/>
+                <w:sz w:val="20"/>
+                <w:szCs w:val="20"/>
+              </w:rPr>
+              <w:t xml:space="preserve">Cierre:</w:t>
+            </w:r>
+            <w:r>
+              <w:rPr>
+                <w:i w:val="1"/>
+                <w:iCs w:val="1"/>
+                <w:color w:val="14161C"/>
+                <w:sz w:val="20"/>
+                <w:szCs w:val="20"/>
+              </w:rPr>
+              <w:t xml:space="preserve"> «Contáctanos y digitaliza tu negocio».</w:t>
+            </w:r>
+          </w:p>
+          <w:p>
+            <w:pPr>
+              <w:spacing w:before="0" w:after="80" w:line="264" w:lineRule="auto"/>
+            </w:pPr>
+            <w:r>
+              <w:rPr>
+                <w:b w:val="1"/>
+                <w:bCs w:val="1"/>
+                <w:i w:val="1"/>
+                <w:iCs w:val="1"/>
+                <w:color w:val="3454D1"/>
+                <w:sz w:val="20"/>
+                <w:szCs w:val="20"/>
+              </w:rPr>
+              <w:t xml:space="preserve">Rúbrica:</w:t>
+            </w:r>
+            <w:r>
+              <w:rPr>
+                <w:i w:val="1"/>
+                <w:iCs w:val="1"/>
+                <w:color w:val="14161C"/>
+                <w:sz w:val="20"/>
+                <w:szCs w:val="20"/>
+              </w:rPr>
+              <w:t xml:space="preserve"> claridad 4 · diferenciación 4 · emoción 3 · credibilidad 4 · llamado a la acción 3.»</w:t>
             </w:r>
           </w:p>
           <w:p>
@@ -1916,7 +1983,7 @@
                 <w:sz w:val="20"/>
                 <w:szCs w:val="20"/>
               </w:rPr>
-              <w:t xml:space="preserve">Diagnóstico de la primera respuesta</w:t>
+              <w:t xml:space="preserve">Lo que detecté al revisarla</w:t>
             </w:r>
           </w:p>
           <w:p>
@@ -1940,15 +2007,15 @@
                 <w:sz w:val="20"/>
                 <w:szCs w:val="20"/>
               </w:rPr>
-              <w:t xml:space="preserve">Genérica:</w:t>
-            </w:r>
-            <w:r>
-              <w:rPr>
-                <w:color w:val="14161C"/>
-                <w:sz w:val="20"/>
-                <w:szCs w:val="20"/>
-              </w:rPr>
-              <w:t xml:space="preserve"> esa frase podría firmarla cualquier empresa de software del mundo.</w:t>
+              <w:t xml:space="preserve">La historia no coincide con la demo:</w:t>
+            </w:r>
+            <w:r>
+              <w:rPr>
+                <w:color w:val="14161C"/>
+                <w:sz w:val="20"/>
+                <w:szCs w:val="20"/>
+              </w:rPr>
+              <w:t xml:space="preserve"> el cliente ideal abarca 5 sectores, pero la demo es de bibliotecas.</w:t>
             </w:r>
           </w:p>
           <w:p>
@@ -1972,15 +2039,15 @@
                 <w:sz w:val="20"/>
                 <w:szCs w:val="20"/>
               </w:rPr>
-              <w:t xml:space="preserve">Rompe las restricciones:</w:t>
-            </w:r>
-            <w:r>
-              <w:rPr>
-                <w:color w:val="14161C"/>
-                <w:sz w:val="20"/>
-                <w:szCs w:val="20"/>
-              </w:rPr>
-              <w:t xml:space="preserve"> usa «innovadoras», «escalables» y «transforman digitalmente».</w:t>
+              <w:t xml:space="preserve">La escena 4 vuelve a «hacemos de todo»:</w:t>
+            </w:r>
+            <w:r>
+              <w:rPr>
+                <w:color w:val="14161C"/>
+                <w:sz w:val="20"/>
+                <w:szCs w:val="20"/>
+              </w:rPr>
+              <w:t xml:space="preserve"> es justo el problema que había que resolver.</w:t>
             </w:r>
           </w:p>
           <w:p>
@@ -2004,15 +2071,15 @@
                 <w:sz w:val="20"/>
                 <w:szCs w:val="20"/>
               </w:rPr>
-              <w:t xml:space="preserve">Cliente demasiado amplio:</w:t>
-            </w:r>
-            <w:r>
-              <w:rPr>
-                <w:color w:val="14161C"/>
-                <w:sz w:val="20"/>
-                <w:szCs w:val="20"/>
-              </w:rPr>
-              <w:t xml:space="preserve"> «PYMES de Latinoamérica» no le dice a nadie a qué puerta tocar.</w:t>
+              <w:t xml:space="preserve">Poca emoción:</w:t>
+            </w:r>
+            <w:r>
+              <w:rPr>
+                <w:color w:val="14161C"/>
+                <w:sz w:val="20"/>
+                <w:szCs w:val="20"/>
+              </w:rPr>
+              <w:t xml:space="preserve"> no hay un personaje humano. La IA lo detectó (3/5), pero corrigió con una frase abstracta.</w:t>
             </w:r>
           </w:p>
           <w:p>
@@ -2036,15 +2103,15 @@
                 <w:sz w:val="20"/>
                 <w:szCs w:val="20"/>
               </w:rPr>
-              <w:t xml:space="preserve">Autoevaluación complaciente:</w:t>
-            </w:r>
-            <w:r>
-              <w:rPr>
-                <w:color w:val="14161C"/>
-                <w:sz w:val="20"/>
-                <w:szCs w:val="20"/>
-              </w:rPr>
-              <w:t xml:space="preserve"> se puso 5/5 en todo. Una rúbrica sin crítica no sirve.</w:t>
+              <w:t xml:space="preserve">Llamado a la acción vago y sin IA visible:</w:t>
+            </w:r>
+            <w:r>
+              <w:rPr>
+                <w:color w:val="14161C"/>
+                <w:sz w:val="20"/>
+                <w:szCs w:val="20"/>
+              </w:rPr>
+              <w:t xml:space="preserve"> «contáctanos» no pide nada concreto, y la respuesta no dice dónde está la IA.</w:t>
             </w:r>
           </w:p>
         </w:tc>
@@ -2106,7 +2173,7 @@
                 <w:sz w:val="20"/>
                 <w:szCs w:val="20"/>
               </w:rPr>
-              <w:t xml:space="preserve">Ronda 2 · Enfoque en el dolor</w:t>
+              <w:t xml:space="preserve">Ronda 2 · Enfoque en el cliente ancla</w:t>
             </w:r>
           </w:p>
           <w:p>
@@ -2121,7 +2188,7 @@
                 <w:sz w:val="20"/>
                 <w:szCs w:val="20"/>
               </w:rPr>
-              <w:t xml:space="preserve">«Esa PUV la podría firmar cualquiera y además rompe las restricciones. Reescríbela desde el dolor de un dueño que pierde citas, ventas o información porque todo vive en WhatsApp y en un cuaderno. Usa </w:t>
+              <w:t xml:space="preserve">«La demo es BiblioTech, así que el cliente ancla tiene que ser una biblioteca, no 5 sectores. Reescribe la ficha para la persona encargada de la biblioteca de un colegio, una universidad o un municipio, y </w:t>
             </w:r>
             <w:r>
               <w:rPr>
@@ -2133,7 +2200,7 @@
                 <w:sz w:val="20"/>
                 <w:szCs w:val="20"/>
               </w:rPr>
-              <w:t xml:space="preserve">un cliente ancla concreto</w:t>
+              <w:t xml:space="preserve">separa a quien usa el sistema de quien aprueba el pago</w:t>
             </w:r>
             <w:r>
               <w:rPr>
@@ -2143,50 +2210,50 @@
                 <w:sz w:val="20"/>
                 <w:szCs w:val="20"/>
               </w:rPr>
-              <w:t xml:space="preserve">: una clínica veterinaria urbana de 1 a 4 veterinarios en Gran Santo Domingo o Santiago. Usa los demás sectores solo como prueba de que el modelo se repite. Vuelve a puntuarte y justifica cada nota con una frase.»</w:t>
-            </w:r>
-          </w:p>
-          <w:p>
-            <w:pPr>
-              <w:spacing w:before="0" w:after="60" w:line="264" w:lineRule="auto"/>
-            </w:pPr>
-            <w:r>
-              <w:rPr>
-                <w:b w:val="1"/>
-                <w:bCs w:val="1"/>
-                <w:color w:val="3454D1"/>
-                <w:sz w:val="20"/>
-                <w:szCs w:val="20"/>
-              </w:rPr>
-              <w:t xml:space="preserve">Ronda 3 · Simulación del jurado (red teaming)</w:t>
-            </w:r>
-          </w:p>
-          <w:p>
-            <w:pPr>
-              <w:spacing w:before="0" w:after="60" w:line="264" w:lineRule="auto"/>
-            </w:pPr>
-            <w:r>
-              <w:rPr>
+              <w:t xml:space="preserve">. Cuenta el dolor con un personaje (caso ilustrativo, sin cifras inventadas). En el pitch, los demás productos van en una sola línea, como prueba de que el método se repite. </w:t>
+            </w:r>
+            <w:r>
+              <w:rPr>
+                <w:b w:val="1"/>
+                <w:bCs w:val="1"/>
                 <w:i w:val="1"/>
                 <w:iCs w:val="1"/>
-                <w:color w:val="14161C"/>
-                <w:sz w:val="20"/>
-                <w:szCs w:val="20"/>
-              </w:rPr>
-              <w:t xml:space="preserve">«Ahora actúa como el jurado más exigente del Desafío Naranja. Ataca la propuesta con las 3 preguntas más difíciles que harías. Luego reescribe el pitch para que las responda </w:t>
-            </w:r>
-            <w:r>
-              <w:rPr>
-                <w:b w:val="1"/>
-                <w:bCs w:val="1"/>
+                <w:color w:val="3454D1"/>
+                <w:sz w:val="20"/>
+                <w:szCs w:val="20"/>
+              </w:rPr>
+              <w:t xml:space="preserve">Dime con honestidad dónde aparece la IA</w:t>
+            </w:r>
+            <w:r>
+              <w:rPr>
                 <w:i w:val="1"/>
                 <w:iCs w:val="1"/>
-                <w:color w:val="3454D1"/>
-                <w:sz w:val="20"/>
-                <w:szCs w:val="20"/>
-              </w:rPr>
-              <w:t xml:space="preserve">antes de que se las hagan</w:t>
-            </w:r>
+                <w:color w:val="14161C"/>
+                <w:sz w:val="20"/>
+                <w:szCs w:val="20"/>
+              </w:rPr>
+              <w:t xml:space="preserve">, sin prometer funciones que no estén construidas. Vuelve a puntuarte y justifica cada nota.»</w:t>
+            </w:r>
+          </w:p>
+          <w:p>
+            <w:pPr>
+              <w:spacing w:before="0" w:after="60" w:line="264" w:lineRule="auto"/>
+            </w:pPr>
+            <w:r>
+              <w:rPr>
+                <w:b w:val="1"/>
+                <w:bCs w:val="1"/>
+                <w:color w:val="3454D1"/>
+                <w:sz w:val="20"/>
+                <w:szCs w:val="20"/>
+              </w:rPr>
+              <w:t xml:space="preserve">Ronda 3 · Simulación del jurado (red teaming)</w:t>
+            </w:r>
+          </w:p>
+          <w:p>
+            <w:pPr>
+              <w:spacing w:before="0" w:after="60" w:line="264" w:lineRule="auto"/>
+            </w:pPr>
             <w:r>
               <w:rPr>
                 <w:i w:val="1"/>
@@ -2195,7 +2262,51 @@
                 <w:sz w:val="20"/>
                 <w:szCs w:val="20"/>
               </w:rPr>
-              <w:t xml:space="preserve">, usando solo datos reales del contexto.»</w:t>
+              <w:t xml:space="preserve">«Ahora actúa como el jurado más exigente del Desafío Naranja. Ataca la propuesta con las 3 preguntas más difíciles que harías. Luego reescribe el pitch para que las responda </w:t>
+            </w:r>
+            <w:r>
+              <w:rPr>
+                <w:b w:val="1"/>
+                <w:bCs w:val="1"/>
+                <w:i w:val="1"/>
+                <w:iCs w:val="1"/>
+                <w:color w:val="3454D1"/>
+                <w:sz w:val="20"/>
+                <w:szCs w:val="20"/>
+              </w:rPr>
+              <w:t xml:space="preserve">antes de que se las hagan</w:t>
+            </w:r>
+            <w:r>
+              <w:rPr>
+                <w:i w:val="1"/>
+                <w:iCs w:val="1"/>
+                <w:color w:val="14161C"/>
+                <w:sz w:val="20"/>
+                <w:szCs w:val="20"/>
+              </w:rPr>
+              <w:t xml:space="preserve">, usando solo datos reales. Cierra pidiendo </w:t>
+            </w:r>
+            <w:r>
+              <w:rPr>
+                <w:b w:val="1"/>
+                <w:bCs w:val="1"/>
+                <w:i w:val="1"/>
+                <w:iCs w:val="1"/>
+                <w:color w:val="3454D1"/>
+                <w:sz w:val="20"/>
+                <w:szCs w:val="20"/>
+              </w:rPr>
+              <w:t xml:space="preserve">5 bibliotecas piloto</w:t>
+            </w:r>
+            <w:r>
+              <w:rPr>
+                <w:i w:val="1"/>
+                <w:iCs w:val="1"/>
+                <w:color w:val="14161C"/>
+                <w:sz w:val="20"/>
+                <w:szCs w:val="20"/>
+              </w:rPr>
+              <w:t xml:space="preserve">.»</w:t>
             </w:r>
           </w:p>
           <w:p>
@@ -2208,7 +2319,7 @@
                 <w:sz w:val="18"/>
                 <w:szCs w:val="18"/>
               </w:rPr>
-              <w:t xml:space="preserve">Preguntas que salieron: ¿Por qué ustedes y no una plataforma extranjera? · ¿Qué pasa si el fundador es una sola persona? · ¿Qué pruebas reales tienen?</w:t>
+              <w:t xml:space="preserve">Preguntas que salieron: ¿Por qué ustedes y no un sistema gratuito o extranjero? · Si el equipo es una persona, ¿quién da soporte? · ¿Qué pruebas tienen de que pueden entregar?</w:t>
             </w:r>
           </w:p>
         </w:tc>
@@ -2270,7 +2381,7 @@
                 <w:sz w:val="20"/>
                 <w:szCs w:val="20"/>
               </w:rPr>
-              <w:t xml:space="preserve">A · Ficha del cliente ideal</w:t>
+              <w:t xml:space="preserve">A · Ficha del cliente ideal (ancla: bibliotecas)</w:t>
             </w:r>
           </w:p>
           <w:p>
@@ -2294,33 +2405,33 @@
                 <w:sz w:val="20"/>
                 <w:szCs w:val="20"/>
               </w:rPr>
-              <w:t xml:space="preserve">Quién:</w:t>
-            </w:r>
-            <w:r>
-              <w:rPr>
-                <w:color w:val="14161C"/>
-                <w:sz w:val="20"/>
-                <w:szCs w:val="20"/>
-              </w:rPr>
-              <w:t xml:space="preserve"> dueño o administrador de un negocio de servicios en RD que factura formalmente. </w:t>
-            </w:r>
-            <w:r>
-              <w:rPr>
-                <w:b w:val="1"/>
-                <w:bCs w:val="1"/>
-                <w:color w:val="3454D1"/>
-                <w:sz w:val="20"/>
-                <w:szCs w:val="20"/>
-              </w:rPr>
-              <w:t xml:space="preserve">Caso ancla:</w:t>
-            </w:r>
-            <w:r>
-              <w:rPr>
-                <w:color w:val="14161C"/>
-                <w:sz w:val="20"/>
-                <w:szCs w:val="20"/>
-              </w:rPr>
-              <w:t xml:space="preserve"> clínica veterinaria urbana de 1 a 4 veterinarios en Gran Santo Domingo o Santiago.</w:t>
+              <w:t xml:space="preserve">Quién lo usa:</w:t>
+            </w:r>
+            <w:r>
+              <w:rPr>
+                <w:color w:val="14161C"/>
+                <w:sz w:val="20"/>
+                <w:szCs w:val="20"/>
+              </w:rPr>
+              <w:t xml:space="preserve"> la persona encargada de la biblioteca de un colegio, una universidad o un municipio en RD, con un equipo de 1 a 3 personas. </w:t>
+            </w:r>
+            <w:r>
+              <w:rPr>
+                <w:b w:val="1"/>
+                <w:bCs w:val="1"/>
+                <w:color w:val="3454D1"/>
+                <w:sz w:val="20"/>
+                <w:szCs w:val="20"/>
+              </w:rPr>
+              <w:t xml:space="preserve">Quién aprueba el pago:</w:t>
+            </w:r>
+            <w:r>
+              <w:rPr>
+                <w:color w:val="14161C"/>
+                <w:sz w:val="20"/>
+                <w:szCs w:val="20"/>
+              </w:rPr>
+              <w:t xml:space="preserve"> la dirección o la administración del centro.</w:t>
             </w:r>
           </w:p>
           <w:p>
@@ -2352,7 +2463,7 @@
                 <w:sz w:val="20"/>
                 <w:szCs w:val="20"/>
               </w:rPr>
-              <w:t xml:space="preserve"> citas por WhatsApp, historiales en cuadernos o Excel e inventario de memoria.</w:t>
+              <w:t xml:space="preserve"> préstamos anotados en un cuaderno o en Excel, fichas de papel e inventario hecho a mano.</w:t>
             </w:r>
           </w:p>
           <w:p>
@@ -2384,7 +2495,7 @@
                 <w:sz w:val="20"/>
                 <w:szCs w:val="20"/>
               </w:rPr>
-              <w:t xml:space="preserve"> citas olvidadas o duplicadas; no encuentra el historial de un paciente cuando lo necesita; no sabe qué se vende ni qué se vence; las plataformas extranjeras cobran en dólares, funcionan en inglés y no tienen a nadie a quien llamar.</w:t>
+              <w:t xml:space="preserve"> no sabe qué libros están prestados ni quién los tiene; los libros no vuelven a fin de año; el inventario toma días; la dirección pide reportes que hay que armar a mano; los lectores no saben qué hay disponible sin ir en persona.</w:t>
             </w:r>
           </w:p>
           <w:p>
@@ -2416,7 +2527,7 @@
                 <w:sz w:val="20"/>
                 <w:szCs w:val="20"/>
               </w:rPr>
-              <w:t xml:space="preserve"> una agenda que recuerda sola, el historial en un clic, saber cuánto entró hoy y cumplir con la DGII sin complicarse.</w:t>
+              <w:t xml:space="preserve"> préstamos y devoluciones en segundos, saber qué está vencido, un catálogo que se consulta desde el celular (portal del lector) y reportes listos para la dirección.</w:t>
             </w:r>
           </w:p>
           <w:p>
@@ -2448,7 +2559,7 @@
                 <w:sz w:val="20"/>
                 <w:szCs w:val="20"/>
               </w:rPr>
-              <w:t xml:space="preserve"> «Es caro» → pago mensual en pesos. «No tengo tiempo de aprender» → implementación acompañada por personas de aquí. «¿Y si la empresa desaparece?» → los datos se pueden exportar y son del cliente.</w:t>
+              <w:t xml:space="preserve"> «No hay presupuesto» → pago en pesos y reportes que justifican la inversión ante la dirección. «No sé de computadoras» → capacitación acompañada por personas de aquí. «Ya tenemos todo en Excel» → DEXA acompaña la carga del catálogo existente.</w:t>
             </w:r>
           </w:p>
           <w:p>
@@ -2486,7 +2597,7 @@
                 <w:sz w:val="22"/>
                 <w:szCs w:val="22"/>
               </w:rPr>
-              <w:t xml:space="preserve">DEXA convierte el WhatsApp y el cuaderno de tu negocio en un sistema con IA, hecho para tu sector, en español, en pesos y con soporte aquí.</w:t>
+              <w:t xml:space="preserve">DEXA convierte el cuaderno, el Excel y el WhatsApp de tu organización en un sistema hecho para tu sector, en español, en pesos y con soporte aquí.</w:t>
             </w:r>
           </w:p>
           <w:p>
@@ -2502,7 +2613,7 @@
                 <w:sz w:val="18"/>
                 <w:szCs w:val="18"/>
               </w:rPr>
-              <w:t xml:space="preserve">Frase de apoyo: «Tecnología de primer nivel, con precio y trato de aquí».</w:t>
+              <w:t xml:space="preserve">Aplicada a BiblioTech: «Tu biblioteca sabe en todo momento qué libro está dónde y quién lo tiene».</w:t>
             </w:r>
           </w:p>
           <w:p>
@@ -2549,7 +2660,7 @@
                 <w:sz w:val="20"/>
                 <w:szCs w:val="20"/>
               </w:rPr>
-              <w:t xml:space="preserve"> HALO aparece junto a un cuaderno y un chat con cientos de mensajes sin leer: «Este es el sistema de la mayoría de los negocios dominicanos».</w:t>
+              <w:t xml:space="preserve"> HALO sostiene un cuaderno de préstamos lleno de tachones: «Este cuaderno es el sistema de muchas bibliotecas del país. Hoy lo vamos a jubilar».</w:t>
             </w:r>
           </w:p>
           <w:p>
@@ -2581,7 +2692,7 @@
                 <w:sz w:val="20"/>
                 <w:szCs w:val="20"/>
               </w:rPr>
-              <w:t xml:space="preserve"> Caso ilustrativo: una veterinaria busca entre chats la última vacuna de un paciente mientras el cliente espera.</w:t>
+              <w:t xml:space="preserve"> Caso ilustrativo: al cierre del año escolar, la bibliotecaria de un colegio busca página por página quién tiene los libros que faltan, mientras la dirección le pide el inventario.</w:t>
             </w:r>
           </w:p>
           <w:p>
@@ -2605,15 +2716,15 @@
                 <w:sz w:val="20"/>
                 <w:szCs w:val="20"/>
               </w:rPr>
-              <w:t xml:space="preserve">1:00–1:50 · Solución en vivo.</w:t>
-            </w:r>
-            <w:r>
-              <w:rPr>
-                <w:color w:val="14161C"/>
-                <w:sz w:val="20"/>
-                <w:szCs w:val="20"/>
-              </w:rPr>
-              <w:t xml:space="preserve"> Demo de 40 segundos: agenda, historial y la IA que sugiere recordatorios. HALO narra cada paso.</w:t>
+              <w:t xml:space="preserve">1:00–1:50 · Demo en vivo de BiblioTech.</w:t>
+            </w:r>
+            <w:r>
+              <w:rPr>
+                <w:color w:val="14161C"/>
+                <w:sz w:val="20"/>
+                <w:szCs w:val="20"/>
+              </w:rPr>
+              <w:t xml:space="preserve"> Buscar un libro, prestarlo, devolverlo, ver los vencidos, consultar el portal del lector desde el celular y sacar el reporte para la dirección. HALO narra cada paso.</w:t>
             </w:r>
           </w:p>
           <w:p>
@@ -2645,7 +2756,7 @@
                 <w:sz w:val="20"/>
                 <w:szCs w:val="20"/>
               </w:rPr>
-              <w:t xml:space="preserve"> Respuestas a las preguntas del jurado, antes de que las hagan: (1) frente a las plataformas extranjeras, precio en pesos desde RD$900 al mes, español y soporte local; (2) frente a ser un equipo pequeño, productos ya construidos y sistemas funcionando en producción; (3) como pruebas, BiblioTech en demo, After lanzada y proyectos entregados (psicologo.do, LIDERA ERP).</w:t>
+              <w:t xml:space="preserve"> Responde al jurado antes de que pregunte: (1) en español, en pesos y con soporte presencial, no un sistema extranjero en dólares; (2) productos ya construidos y sistemas funcionando en producción (After, psicologo.do, LIDERA ERP); (3) el método se repite, porque la facturación electrónica y DEXA Vet ya siguen el mismo camino. La IA, contada con honestidad: hoy está en cómo DEXA diseña y construye, y la próxima fase es HALO como asistente que recomienda lecturas y avisa vencimientos.</w:t>
             </w:r>
           </w:p>
           <w:p>
@@ -2677,7 +2788,25 @@
                 <w:sz w:val="20"/>
                 <w:szCs w:val="20"/>
               </w:rPr>
-              <w:t xml:space="preserve"> Visión y llamado a la acción: «Buscamos nuestras primeras clínicas y bibliotecas piloto [POR CONFIRMAR: cantidad]». HALO cierra con el lema.</w:t>
+              <w:t xml:space="preserve"> «Buscamos </w:t>
+            </w:r>
+            <w:r>
+              <w:rPr>
+                <w:b w:val="1"/>
+                <w:bCs w:val="1"/>
+                <w:color w:val="3454D1"/>
+                <w:sz w:val="20"/>
+                <w:szCs w:val="20"/>
+              </w:rPr>
+              <w:t xml:space="preserve">5 bibliotecas piloto</w:t>
+            </w:r>
+            <w:r>
+              <w:rPr>
+                <w:color w:val="14161C"/>
+                <w:sz w:val="20"/>
+                <w:szCs w:val="20"/>
+              </w:rPr>
+              <w:t xml:space="preserve"> (colegios, universidades o municipios) para implementar BiblioTech. ¿Cuál será la primera?». HALO cierra con el lema: «Diseñando tecnología para un mundo más inteligente».</w:t>
             </w:r>
           </w:p>
           <w:p>
@@ -2692,7 +2821,7 @@
                 <w:sz w:val="18"/>
                 <w:szCs w:val="18"/>
               </w:rPr>
-              <w:t xml:space="preserve">Rúbrica final de la IA tras la corrección:</w:t>
+              <w:t xml:space="preserve">Rúbrica final tras 3 rondas:</w:t>
             </w:r>
             <w:r>
               <w:rPr>
@@ -2700,7 +2829,7 @@
                 <w:sz w:val="18"/>
                 <w:szCs w:val="18"/>
               </w:rPr>
-              <w:t xml:space="preserve"> claridad 5 · diferenciación 4 · emoción 4 · credibilidad 4 · llamado a la acción 4. La meta de pilotos queda pendiente de definir.</w:t>
+              <w:t xml:space="preserve"> claridad 5 · diferenciación 4 · emoción 4 · credibilidad 4 · llamado a la acción 5. La transcripción completa está en la bitácora anexa.</w:t>
             </w:r>
           </w:p>
         </w:tc>
@@ -2872,7 +3001,7 @@
                 <w:sz w:val="20"/>
                 <w:szCs w:val="20"/>
               </w:rPr>
-              <w:t xml:space="preserve"> pasa de 8 sectores dispersos a un cliente ancla (la clínica veterinaria urbana), con los demás sectores como prueba de que el modelo se repite. La </w:t>
+              <w:t xml:space="preserve"> pasa de 8 sectores dispersos a un cliente ancla, las bibliotecas de colegios, universidades y municipios, y distingue a quien usa el sistema de quien lo paga. La </w:t>
             </w:r>
             <w:r>
               <w:rPr>
@@ -2890,7 +3019,7 @@
                 <w:sz w:val="20"/>
                 <w:szCs w:val="20"/>
               </w:rPr>
-              <w:t xml:space="preserve"> queda en una sola frase que cualquier persona entiende. El </w:t>
+              <w:t xml:space="preserve"> queda en una sola frase que cualquiera entiende. El </w:t>
             </w:r>
             <w:r>
               <w:rPr>
@@ -2908,7 +3037,7 @@
                 <w:sz w:val="20"/>
                 <w:szCs w:val="20"/>
               </w:rPr>
-              <w:t xml:space="preserve"> se apoya en tres dolores observables. La </w:t>
+              <w:t xml:space="preserve"> se apoya en dolores observables, como libros que no vuelven, inventarios de días y reportes hechos a mano. La </w:t>
             </w:r>
             <w:r>
               <w:rPr>
@@ -2926,25 +3055,43 @@
                 <w:sz w:val="20"/>
                 <w:szCs w:val="20"/>
               </w:rPr>
-              <w:t xml:space="preserve"> se vuelve explícita: productos ya construidos, IA integrada y soporte local en pesos, algo que ni las desarrolladoras locales ni las plataformas extranjeras ofrecen juntas. Además, el ejercicio dejó a la vista una decisión que el pitch necesita: </w:t>
-            </w:r>
-            <w:r>
-              <w:rPr>
-                <w:b w:val="1"/>
-                <w:bCs w:val="1"/>
-                <w:color w:val="3454D1"/>
-                <w:sz w:val="20"/>
-                <w:szCs w:val="20"/>
-              </w:rPr>
-              <w:t xml:space="preserve">qué producto abre la demo</w:t>
-            </w:r>
-            <w:r>
-              <w:rPr>
-                <w:color w:val="14161C"/>
-                <w:sz w:val="20"/>
-                <w:szCs w:val="20"/>
-              </w:rPr>
-              <w:t xml:space="preserve">, BiblioTech o DEXA Vet.</w:t>
+              <w:t xml:space="preserve"> se vuelve explícita: productos ya construidos, soporte local y precios en pesos. La </w:t>
+            </w:r>
+            <w:r>
+              <w:rPr>
+                <w:b w:val="1"/>
+                <w:bCs w:val="1"/>
+                <w:color w:val="3454D1"/>
+                <w:sz w:val="20"/>
+                <w:szCs w:val="20"/>
+              </w:rPr>
+              <w:t xml:space="preserve">métrica clave</w:t>
+            </w:r>
+            <w:r>
+              <w:rPr>
+                <w:color w:val="14161C"/>
+                <w:sz w:val="20"/>
+                <w:szCs w:val="20"/>
+              </w:rPr>
+              <w:t xml:space="preserve"> del lanzamiento queda definida: </w:t>
+            </w:r>
+            <w:r>
+              <w:rPr>
+                <w:b w:val="1"/>
+                <w:bCs w:val="1"/>
+                <w:color w:val="3454D1"/>
+                <w:sz w:val="20"/>
+                <w:szCs w:val="20"/>
+              </w:rPr>
+              <w:t xml:space="preserve">5 bibliotecas piloto</w:t>
+            </w:r>
+            <w:r>
+              <w:rPr>
+                <w:color w:val="14161C"/>
+                <w:sz w:val="20"/>
+                <w:szCs w:val="20"/>
+              </w:rPr>
+              <w:t xml:space="preserve">. Además, el pitch ya no enumera productos; cuenta una sola historia con BiblioTech y usa el resto del portafolio como prueba de que el modelo se repite.</w:t>
             </w:r>
           </w:p>
           <w:p>
@@ -2975,7 +3122,7 @@
                 <w:sz w:val="20"/>
                 <w:szCs w:val="20"/>
               </w:rPr>
-              <w:t xml:space="preserve">: rol, contexto, tarea, formato, autocrítica y jurado simulado. Ese Prompt Maestro se vuelve una </w:t>
+              <w:t xml:space="preserve">: rol, contexto, tarea, formato, autocrítica y jurado simulado. La primera respuesta era correcta pero dispersa, y fueron las dos iteraciones las que la volvieron específica, honesta y defendible. Ese Prompt Maestro queda como </w:t>
             </w:r>
             <w:r>
               <w:rPr>
@@ -2993,7 +3140,7 @@
                 <w:sz w:val="20"/>
                 <w:szCs w:val="20"/>
               </w:rPr>
-              <w:t xml:space="preserve"> para cada vertical nueva de DEXA (restaurantes con DEXA Menu, clínicas de otras especialidades, comercios), porque basta con cambiar el cliente ancla. Así la IA forma parte de la estrategia de la empresa y también del producto, donde HALO es la cara de esa inteligencia frente al cliente. Para el Desafío Naranja, DEXA llega con un mensaje único, coherente con su marca y defendible frente a las preguntas difíciles.</w:t>
+              <w:t xml:space="preserve">: basta con cambiar el cliente ancla para preparar el mensaje de facturación electrónica, de DEXA Vet o de cualquier vertical nueva. Así la IA forma parte de cómo DEXA piensa y vende, y en la próxima fase del producto, HALO será la cara de esa inteligencia frente a cada lector.</w:t>
             </w:r>
           </w:p>
         </w:tc>

</xml_diff>

<commit_message>
Entregable Maker Lab: equipo completo, precios en dólares, proyección internacional y un solo archivo
Co-Authored-By: Claude Opus 5.5 <noreply@anthropic.com>
Claude-Session: https://claude.ai/code/session_011usEwMPrKxbEBJCtKfXjqw
</commit_message>
<xml_diff>
--- a/Entregable_Maker_Lab_IA_DEXA_Desafio_Naranja_2026.docx
+++ b/Entregable_Maker_Lab_IA_DEXA_Desafio_Naranja_2026.docx
@@ -278,7 +278,7 @@
                 <w:sz w:val="18"/>
                 <w:szCs w:val="18"/>
               </w:rPr>
-              <w:t xml:space="preserve">Software por sector con IA integrada para las PYMES dominicanas. Lema: «Diseñando tecnología para un mundo más inteligente».</w:t>
+              <w:t xml:space="preserve">Software por sector con IA integrada para PYMES y organizaciones, desde República Dominicana hacia la región. Lema: «Diseñando tecnología para un mundo más inteligente».</w:t>
             </w:r>
           </w:p>
         </w:tc>
@@ -330,6 +330,98 @@
           </w:tcPr>
           <w:p>
             <w:pPr>
+              <w:spacing w:before="0" w:after="20" w:line="264" w:lineRule="auto"/>
+            </w:pPr>
+            <w:r>
+              <w:rPr>
+                <w:b w:val="1"/>
+                <w:bCs w:val="1"/>
+                <w:color w:val="3454D1"/>
+                <w:sz w:val="20"/>
+                <w:szCs w:val="20"/>
+              </w:rPr>
+              <w:t xml:space="preserve">Keury Manuel Durán García</w:t>
+            </w:r>
+            <w:r>
+              <w:rPr>
+                <w:color w:val="14161C"/>
+                <w:sz w:val="20"/>
+                <w:szCs w:val="20"/>
+              </w:rPr>
+              <w:t xml:space="preserve"> — Fundador y líder de desarrollo</w:t>
+            </w:r>
+          </w:p>
+          <w:p>
+            <w:pPr>
+              <w:spacing w:before="0" w:after="20" w:line="264" w:lineRule="auto"/>
+            </w:pPr>
+            <w:r>
+              <w:rPr>
+                <w:b w:val="1"/>
+                <w:bCs w:val="1"/>
+                <w:color w:val="3454D1"/>
+                <w:sz w:val="20"/>
+                <w:szCs w:val="20"/>
+              </w:rPr>
+              <w:t xml:space="preserve">Gabriela Domínguez Abreu</w:t>
+            </w:r>
+            <w:r>
+              <w:rPr>
+                <w:color w:val="14161C"/>
+                <w:sz w:val="20"/>
+                <w:szCs w:val="20"/>
+              </w:rPr>
+              <w:t xml:space="preserve"> — Cofundadora, marketing y relaciones</w:t>
+            </w:r>
+          </w:p>
+          <w:p>
+            <w:pPr>
+              <w:spacing w:before="0" w:after="20" w:line="264" w:lineRule="auto"/>
+            </w:pPr>
+            <w:r>
+              <w:rPr>
+                <w:b w:val="1"/>
+                <w:bCs w:val="1"/>
+                <w:color w:val="3454D1"/>
+                <w:sz w:val="20"/>
+                <w:szCs w:val="20"/>
+              </w:rPr>
+              <w:t xml:space="preserve">Yulian Marte Núñez</w:t>
+            </w:r>
+            <w:r>
+              <w:rPr>
+                <w:color w:val="14161C"/>
+                <w:sz w:val="20"/>
+                <w:szCs w:val="20"/>
+              </w:rPr>
+              <w:t xml:space="preserve"> — Desarrollo</w:t>
+            </w:r>
+          </w:p>
+          <w:p>
+            <w:pPr>
+              <w:spacing w:before="0" w:after="20" w:line="264" w:lineRule="auto"/>
+            </w:pPr>
+            <w:r>
+              <w:rPr>
+                <w:b w:val="1"/>
+                <w:bCs w:val="1"/>
+                <w:color w:val="3454D1"/>
+                <w:sz w:val="20"/>
+                <w:szCs w:val="20"/>
+              </w:rPr>
+              <w:t xml:space="preserve">Francis Santiago</w:t>
+            </w:r>
+            <w:r>
+              <w:rPr>
+                <w:color w:val="14161C"/>
+                <w:sz w:val="20"/>
+                <w:szCs w:val="20"/>
+              </w:rPr>
+              <w:t xml:space="preserve"> — Bases de datos</w:t>
+            </w:r>
+          </w:p>
+          <w:p>
+            <w:pPr>
               <w:spacing w:before="0" w:after="0" w:line="264" w:lineRule="auto"/>
             </w:pPr>
             <w:r>
@@ -340,15 +432,15 @@
                 <w:sz w:val="20"/>
                 <w:szCs w:val="20"/>
               </w:rPr>
-              <w:t xml:space="preserve">Keury Manuel Durán García</w:t>
-            </w:r>
-            <w:r>
-              <w:rPr>
-                <w:color w:val="14161C"/>
-                <w:sz w:val="20"/>
-                <w:szCs w:val="20"/>
-              </w:rPr>
-              <w:t xml:space="preserve"> — Fundador, desarrollador principal y responsable de producto.</w:t>
+              <w:t xml:space="preserve">Arlenis Rodríguez</w:t>
+            </w:r>
+            <w:r>
+              <w:rPr>
+                <w:color w:val="14161C"/>
+                <w:sz w:val="20"/>
+                <w:szCs w:val="20"/>
+              </w:rPr>
+              <w:t xml:space="preserve"> — Recursos humanos</w:t>
             </w:r>
           </w:p>
         </w:tc>
@@ -774,7 +866,7 @@
                 <w:sz w:val="20"/>
                 <w:szCs w:val="20"/>
               </w:rPr>
-              <w:t xml:space="preserve">Cada documento cuenta una historia distinta: el Plan de Empresa, el Libro de Marca y la web no coinciden en el producto principal, los precios ni las cifras. Para un jurado o para el dueño de una PYME, «hacemos de todo» se traduce en «no sé para qué los contrataría».</w:t>
+              <w:t xml:space="preserve">Con tantos productos, el riesgo es que el mensaje se disperse. Para un jurado o para el dueño de una PYME, «hacemos de todo» se traduce en «no sé para qué los contrataría». Hacía falta enfocar la historia en un solo cliente y una sola demo.</w:t>
             </w:r>
           </w:p>
           <w:p>
@@ -1352,17 +1444,17 @@
                 <w:sz w:val="20"/>
                 <w:szCs w:val="20"/>
               </w:rPr>
-              <w:t xml:space="preserve">, empresa de software fundada en Constanza (RD) por un estudiante de Ingeniería de Software. Crea </w:t>
-            </w:r>
-            <w:r>
-              <w:rPr>
-                <w:b w:val="1"/>
-                <w:bCs w:val="1"/>
-                <w:color w:val="3454D1"/>
-                <w:sz w:val="20"/>
-                <w:szCs w:val="20"/>
-              </w:rPr>
-              <w:t xml:space="preserve">software especializado por sector, con IA integrada, soporte local en español y precios en pesos</w:t>
+              <w:t xml:space="preserve">, empresa de software fundada en Constanza (RD) por Keury Manuel Durán García, con un equipo de 5 personas. Crea </w:t>
+            </w:r>
+            <w:r>
+              <w:rPr>
+                <w:b w:val="1"/>
+                <w:bCs w:val="1"/>
+                <w:color w:val="3454D1"/>
+                <w:sz w:val="20"/>
+                <w:szCs w:val="20"/>
+              </w:rPr>
+              <w:t xml:space="preserve">software especializado por sector, con IA integrada, soporte cercano en español y precios competitivos en dólares</w:t>
             </w:r>
             <w:r>
               <w:rPr>
@@ -1452,7 +1544,25 @@
                 <w:sz w:val="20"/>
                 <w:szCs w:val="20"/>
               </w:rPr>
-              <w:t xml:space="preserve"> desarrolladoras locales sin producto propio y plataformas extranjeras que cobran en dólares y no ofrecen soporte local. </w:t>
+              <w:t xml:space="preserve"> desarrolladoras locales sin producto propio y plataformas extranjeras sin soporte cercano en español. </w:t>
+            </w:r>
+            <w:r>
+              <w:rPr>
+                <w:b w:val="1"/>
+                <w:bCs w:val="1"/>
+                <w:color w:val="3454D1"/>
+                <w:sz w:val="20"/>
+                <w:szCs w:val="20"/>
+              </w:rPr>
+              <w:t xml:space="preserve">Proyección:</w:t>
+            </w:r>
+            <w:r>
+              <w:rPr>
+                <w:color w:val="14161C"/>
+                <w:sz w:val="20"/>
+                <w:szCs w:val="20"/>
+              </w:rPr>
+              <w:t xml:space="preserve"> posibles colaboraciones en conversación con otros países. </w:t>
             </w:r>
             <w:r>
               <w:rPr>
@@ -1709,7 +1819,7 @@
                 <w:sz w:val="17"/>
                 <w:szCs w:val="17"/>
               </w:rPr>
-              <w:t xml:space="preserve">&lt;rol&gt; Eres estratega de producto y storytelling para startups de software latinoamericanas y has sido jurado de concursos de economía naranja. Lees cada frase como lo haría el dueño de una PYME dominicana sin formación técnica: si algo suena a jerga, lo descartas. &lt;/rol&gt; &lt;contexto&gt; DEXA Technologies es una empresa de software fundada en Constanza, República Dominicana, por un estudiante de Ingeniería de Software. Crea software especializado por sector, con IA integrada, soporte local en español y precios en pesos. Portafolio: BiblioTech (gestión de bibliotecas con catálogo, préstamos, portal del lector y reportes; demo funcional; es el producto de la demo en vivo), sistema de facturación electrónica e-CF, DEXA Vet (gestión veterinaria, en desarrollo), After (hábitos y finanzas con IA, lanzada) y proyectos entregados a clientes (psicologo.do, LIDERA ERP). Cliente objetivo: organizaciones y PYMES que aún operan con cuadernos, Excel o WhatsApp. Competencia: desarrolladoras locales sin producto propio y plataformas extranjeras cobradas en dólares y sin soporte local. Mascota: HALO, un robot con cabeza de monitor retro y hoodie blanco. Lema: «Diseñando tecnología para un mundo más inteligente». &lt;/contexto&gt; &lt;tarea&gt; 1) Construye la ficha del cliente ideal (perfil, dolores, beneficios esperados y objeciones). 2) Redacta 3 variantes de Propuesta Única de Valor (máximo 30 palabras cada una), elige la más fuerte y justifica la elección. 3) Diseña el arco de un pitch de 3 minutos para el Desafío Naranja 2026 guiado por HALO. 4) Evalúa tu propio resultado como jurado y corrige lo débil antes de entregar. &lt;/tarea&gt; &lt;formato&gt; Ficha en viñetas; PUV en un cuadro delimitado; pitch en una tabla de 5 escenas (tiempo · qué dice HALO · qué se ve en pantalla); al final, una rúbrica del 1 al 5 con la versión corregida de todo lo que obtenga menos de 4. &lt;/formato&gt; &lt;restricciones&gt; Usa español claro y un tono profesional y cercano. No uses «innovador», «escalable», «SaaS» ni «transformación digital». No inventes cifras, clientes ni estadísticas; si falta un dato, escribe [POR CONFIRMAR]. Si falta algo crítico, hazme como máximo 3 preguntas antes de empezar; si no falta nada, procede. &lt;/restricciones&gt;</w:t>
+              <w:t xml:space="preserve">&lt;rol&gt; Eres estratega de producto y storytelling para startups de software latinoamericanas y has sido jurado de concursos de economía naranja. Lees cada frase como lo haría el dueño de una PYME dominicana sin formación técnica: si algo suena a jerga, lo descartas. &lt;/rol&gt; &lt;contexto&gt; DEXA Technologies es una empresa de software fundada en Constanza, República Dominicana, por Keury Manuel Durán García, con un equipo de 5 personas. Crea software especializado por sector, con IA integrada, soporte cercano en español y precios competitivos en dólares. Portafolio: BiblioTech (gestión de bibliotecas con catálogo, préstamos, portal del lector y reportes; demo funcional; es el producto de la demo en vivo), sistema de facturación electrónica e-CF, DEXA Vet (gestión veterinaria, en desarrollo), After (hábitos y finanzas con IA, lanzada) y proyectos entregados a clientes (psicologo.do, LIDERA ERP). Cliente objetivo: organizaciones y PYMES que aún operan con cuadernos, Excel o WhatsApp. Competencia: desarrolladoras locales sin producto propio y plataformas extranjeras sin soporte cercano en español. Proyección: hay posibles colaboraciones en conversación con otros países. Mascota: HALO, un robot con cabeza de monitor retro y hoodie blanco. Lema: «Diseñando tecnología para un mundo más inteligente». &lt;/contexto&gt; &lt;tarea&gt; 1) Construye la ficha del cliente ideal (perfil, dolores, beneficios esperados y objeciones). 2) Redacta 3 variantes de Propuesta Única de Valor (máximo 30 palabras cada una), elige la más fuerte y justifica la elección. 3) Diseña el arco de un pitch de 3 minutos para el Desafío Naranja 2026 guiado por HALO. 4) Evalúa tu propio resultado como jurado y corrige lo débil antes de entregar. &lt;/tarea&gt; &lt;formato&gt; Ficha en viñetas; PUV en un cuadro delimitado; pitch en una tabla de 5 escenas (tiempo · qué dice HALO · qué se ve en pantalla); al final, una rúbrica del 1 al 5 con la versión corregida de todo lo que obtenga menos de 4. &lt;/formato&gt; &lt;restricciones&gt; Usa español claro y un tono profesional y cercano. No uses «innovador», «escalable», «SaaS» ni «transformación digital». No inventes cifras, clientes ni estadísticas; si falta un dato, escribe [POR CONFIRMAR]. Si falta algo crítico, hazme como máximo 3 preguntas antes de empezar; si no falta nada, procede. &lt;/restricciones&gt;</w:t>
             </w:r>
           </w:p>
         </w:tc>
@@ -1892,7 +2002,7 @@
                 <w:sz w:val="20"/>
                 <w:szCs w:val="20"/>
               </w:rPr>
-              <w:t xml:space="preserve"> Software hecho para tu tipo de negocio, en español, en pesos y con gente de aquí que te responde.</w:t>
+              <w:t xml:space="preserve"> Software hecho para tu tipo de negocio, en español y con gente cercana que te responde.</w:t>
             </w:r>
           </w:p>
           <w:p>
@@ -2319,7 +2429,7 @@
                 <w:sz w:val="18"/>
                 <w:szCs w:val="18"/>
               </w:rPr>
-              <w:t xml:space="preserve">Preguntas que salieron: ¿Por qué ustedes y no un sistema gratuito o extranjero? · Si el equipo es una persona, ¿quién da soporte? · ¿Qué pruebas tienen de que pueden entregar?</w:t>
+              <w:t xml:space="preserve">Preguntas que salieron: ¿Por qué ustedes y no un sistema gratuito o extranjero? · Si la empresa es nueva, ¿quién da soporte cuando algo falla? · ¿Qué pruebas tienen de que pueden entregar?</w:t>
             </w:r>
           </w:p>
         </w:tc>
@@ -2559,7 +2669,7 @@
                 <w:sz w:val="20"/>
                 <w:szCs w:val="20"/>
               </w:rPr>
-              <w:t xml:space="preserve"> «No hay presupuesto» → pago en pesos y reportes que justifican la inversión ante la dirección. «No sé de computadoras» → capacitación acompañada por personas de aquí. «Ya tenemos todo en Excel» → DEXA acompaña la carga del catálogo existente.</w:t>
+              <w:t xml:space="preserve"> «No hay presupuesto» → planes mensuales accesibles y reportes que justifican la inversión ante la dirección. «No sé de computadoras» → capacitación acompañada por personas de aquí. «Ya tenemos todo en Excel» → DEXA acompaña la carga del catálogo existente.</w:t>
             </w:r>
           </w:p>
           <w:p>
@@ -2597,7 +2707,7 @@
                 <w:sz w:val="22"/>
                 <w:szCs w:val="22"/>
               </w:rPr>
-              <w:t xml:space="preserve">DEXA convierte el cuaderno, el Excel y el WhatsApp de tu organización en un sistema hecho para tu sector, en español, en pesos y con soporte aquí.</w:t>
+              <w:t xml:space="preserve">DEXA convierte el cuaderno, el Excel y el WhatsApp de tu organización en un sistema hecho para tu sector, en español y con soporte de personas reales.</w:t>
             </w:r>
           </w:p>
           <w:p>
@@ -2756,7 +2866,7 @@
                 <w:sz w:val="20"/>
                 <w:szCs w:val="20"/>
               </w:rPr>
-              <w:t xml:space="preserve"> Responde al jurado antes de que pregunte: (1) en español, en pesos y con soporte presencial, no un sistema extranjero en dólares; (2) productos ya construidos y sistemas funcionando en producción (After, psicologo.do, LIDERA ERP); (3) el método se repite, porque la facturación electrónica y DEXA Vet ya siguen el mismo camino. La IA, contada con honestidad: hoy está en cómo DEXA diseña y construye, y la próxima fase es HALO como asistente que recomienda lecturas y avisa vencimientos.</w:t>
+              <w:t xml:space="preserve"> Responde al jurado antes de que pregunte: (1) en español, con acompañamiento cercano y precios competitivos frente a sistemas extranjeros sin soporte en nuestro idioma; (2) un equipo de 5 personas, con productos ya construidos y sistemas funcionando en producción (After, psicologo.do, LIDERA ERP); (3) el método se repite, porque la facturación electrónica y DEXA Vet ya siguen el mismo camino, y hay posibles colaboraciones en conversación con otros países. La IA, contada con honestidad: hoy está en cómo DEXA diseña y construye, y la próxima fase es HALO como asistente que recomienda lecturas y avisa vencimientos.</w:t>
             </w:r>
           </w:p>
           <w:p>
@@ -2829,7 +2939,7 @@
                 <w:sz w:val="18"/>
                 <w:szCs w:val="18"/>
               </w:rPr>
-              <w:t xml:space="preserve"> claridad 5 · diferenciación 4 · emoción 4 · credibilidad 4 · llamado a la acción 5. La transcripción completa está en la bitácora anexa.</w:t>
+              <w:t xml:space="preserve"> claridad 5 · diferenciación 4 · emoción 4 · credibilidad 4 · llamado a la acción 5.</w:t>
             </w:r>
           </w:p>
         </w:tc>
@@ -3055,7 +3165,7 @@
                 <w:sz w:val="20"/>
                 <w:szCs w:val="20"/>
               </w:rPr>
-              <w:t xml:space="preserve"> se vuelve explícita: productos ya construidos, soporte local y precios en pesos. La </w:t>
+              <w:t xml:space="preserve"> se vuelve explícita: productos ya construidos, un equipo de 5 personas, soporte cercano en español y una proyección internacional, con posibles colaboraciones en otros países. La </w:t>
             </w:r>
             <w:r>
               <w:rPr>

</xml_diff>